<commit_message>
update controller, service, repo, mapper for appointment, staff, service to frontend call for appointment
</commit_message>
<xml_diff>
--- a/database/flow.docx
+++ b/database/flow.docx
@@ -1296,6 +1296,805 @@
       <w:r>
         <w:t>Các tin nhắn hỏi đáp được lưu chi tiết vào bảng chat_message làm cơ sở đối soát (Audit).</w:t>
       </w:r>
+    </w:p>
+    <w:p>
+      <w:pPr>
+        <w:pStyle w:val="ListParagraph"/>
+        <w:numPr>
+          <w:ilvl w:val="0"/>
+          <w:numId w:val="32"/>
+        </w:numPr>
+        <w:spacing w:before="100" w:beforeAutospacing="1" w:after="100" w:afterAutospacing="1" w:line="240" w:lineRule="auto"/>
+        <w:outlineLvl w:val="0"/>
+        <w:rPr>
+          <w:rFonts w:ascii="Times New Roman" w:eastAsia="Times New Roman" w:hAnsi="Times New Roman" w:cs="Times New Roman"/>
+          <w:b/>
+          <w:bCs/>
+          <w:kern w:val="36"/>
+          <w:sz w:val="48"/>
+          <w:szCs w:val="48"/>
+          <w14:ligatures w14:val="none"/>
+        </w:rPr>
+      </w:pPr>
+      <w:r>
+        <w:rPr>
+          <w:rFonts w:ascii="Times New Roman" w:eastAsia="Times New Roman" w:hAnsi="Times New Roman" w:cs="Times New Roman"/>
+          <w:b/>
+          <w:bCs/>
+          <w:kern w:val="36"/>
+          <w:sz w:val="48"/>
+          <w:szCs w:val="48"/>
+          <w14:ligatures w14:val="none"/>
+        </w:rPr>
+        <w:lastRenderedPageBreak/>
+        <w:t xml:space="preserve">FLOW MỚI FINAL </w:t>
+      </w:r>
+      <w:r>
+        <w:rPr>
+          <w:rFonts w:ascii="Segoe UI Emoji" w:eastAsia="Times New Roman" w:hAnsi="Segoe UI Emoji" w:cs="Segoe UI Emoji"/>
+          <w:b/>
+          <w:bCs/>
+          <w:kern w:val="36"/>
+          <w:sz w:val="48"/>
+          <w:szCs w:val="48"/>
+          <w14:ligatures w14:val="none"/>
+        </w:rPr>
+        <w:t>😄</w:t>
+      </w:r>
+    </w:p>
+    <w:p>
+      <w:pPr>
+        <w:pStyle w:val="ListParagraph"/>
+        <w:numPr>
+          <w:ilvl w:val="0"/>
+          <w:numId w:val="32"/>
+        </w:numPr>
+        <w:spacing w:before="100" w:beforeAutospacing="1" w:after="100" w:afterAutospacing="1" w:line="240" w:lineRule="auto"/>
+        <w:outlineLvl w:val="1"/>
+        <w:rPr>
+          <w:rFonts w:ascii="Times New Roman" w:eastAsia="Times New Roman" w:hAnsi="Times New Roman" w:cs="Times New Roman"/>
+          <w:b/>
+          <w:bCs/>
+          <w:kern w:val="0"/>
+          <w:sz w:val="36"/>
+          <w:szCs w:val="36"/>
+          <w14:ligatures w14:val="none"/>
+        </w:rPr>
+      </w:pPr>
+      <w:r>
+        <w:rPr>
+          <w:rFonts w:ascii="Times New Roman" w:eastAsia="Times New Roman" w:hAnsi="Times New Roman" w:cs="Times New Roman"/>
+          <w:b/>
+          <w:bCs/>
+          <w:kern w:val="0"/>
+          <w:sz w:val="36"/>
+          <w:szCs w:val="36"/>
+          <w14:ligatures w14:val="none"/>
+        </w:rPr>
+        <w:t>1. Chọn từ bác sĩ</w:t>
+      </w:r>
+    </w:p>
+    <w:p>
+      <w:pPr>
+        <w:pStyle w:val="ListParagraph"/>
+        <w:numPr>
+          <w:ilvl w:val="0"/>
+          <w:numId w:val="32"/>
+        </w:numPr>
+        <w:tabs>
+          <w:tab w:val="left" w:pos="916"/>
+          <w:tab w:val="left" w:pos="1832"/>
+          <w:tab w:val="left" w:pos="2748"/>
+          <w:tab w:val="left" w:pos="3664"/>
+          <w:tab w:val="left" w:pos="4580"/>
+          <w:tab w:val="left" w:pos="5496"/>
+          <w:tab w:val="left" w:pos="6412"/>
+          <w:tab w:val="left" w:pos="7328"/>
+          <w:tab w:val="left" w:pos="8244"/>
+          <w:tab w:val="left" w:pos="9160"/>
+          <w:tab w:val="left" w:pos="10076"/>
+          <w:tab w:val="left" w:pos="10992"/>
+          <w:tab w:val="left" w:pos="11908"/>
+          <w:tab w:val="left" w:pos="12824"/>
+          <w:tab w:val="left" w:pos="13740"/>
+          <w:tab w:val="left" w:pos="14656"/>
+        </w:tabs>
+        <w:spacing w:before="0" w:after="0" w:line="240" w:lineRule="auto"/>
+        <w:rPr>
+          <w:rFonts w:ascii="Courier New" w:eastAsia="Times New Roman" w:hAnsi="Courier New" w:cs="Courier New"/>
+          <w:kern w:val="0"/>
+          <w:sz w:val="20"/>
+          <w:szCs w:val="20"/>
+          <w14:ligatures w14:val="none"/>
+        </w:rPr>
+      </w:pPr>
+      <w:r>
+        <w:rPr>
+          <w:rFonts w:ascii="Courier New" w:eastAsia="Times New Roman" w:hAnsi="Courier New" w:cs="Courier New"/>
+          <w:kern w:val="0"/>
+          <w:sz w:val="20"/>
+          <w:szCs w:val="20"/>
+          <w14:ligatures w14:val="none"/>
+        </w:rPr>
+        <w:t>doctorId có</w:t>
+      </w:r>
+      <w:r>
+        <w:rPr>
+          <w:rFonts w:ascii="Courier New" w:eastAsia="Times New Roman" w:hAnsi="Courier New" w:cs="Courier New"/>
+          <w:kern w:val="0"/>
+          <w:sz w:val="20"/>
+          <w:szCs w:val="20"/>
+          <w14:ligatures w14:val="none"/>
+        </w:rPr>
+        <w:br/>
+      </w:r>
+      <w:r>
+        <w:rPr>
+          <w:rFonts w:ascii="Courier New" w:eastAsia="Times New Roman" w:hAnsi="Courier New" w:cs="Courier New"/>
+          <w:kern w:val="0"/>
+          <w:sz w:val="20"/>
+          <w:szCs w:val="20"/>
+          <w14:ligatures w14:val="none"/>
+        </w:rPr>
+        <w:br/>
+        <w:t>→ lock doctor</w:t>
+      </w:r>
+      <w:r>
+        <w:rPr>
+          <w:rFonts w:ascii="Courier New" w:eastAsia="Times New Roman" w:hAnsi="Courier New" w:cs="Courier New"/>
+          <w:kern w:val="0"/>
+          <w:sz w:val="20"/>
+          <w:szCs w:val="20"/>
+          <w14:ligatures w14:val="none"/>
+        </w:rPr>
+        <w:br/>
+        <w:t>→ lock expertise</w:t>
+      </w:r>
+      <w:r>
+        <w:rPr>
+          <w:rFonts w:ascii="Courier New" w:eastAsia="Times New Roman" w:hAnsi="Courier New" w:cs="Courier New"/>
+          <w:kern w:val="0"/>
+          <w:sz w:val="20"/>
+          <w:szCs w:val="20"/>
+          <w14:ligatures w14:val="none"/>
+        </w:rPr>
+        <w:br/>
+        <w:t>→ service optional</w:t>
+      </w:r>
+    </w:p>
+    <w:p>
+      <w:pPr>
+        <w:pStyle w:val="ListParagraph"/>
+        <w:numPr>
+          <w:ilvl w:val="0"/>
+          <w:numId w:val="32"/>
+        </w:numPr>
+        <w:spacing w:before="0" w:after="0" w:line="240" w:lineRule="auto"/>
+        <w:rPr>
+          <w:rFonts w:ascii="Times New Roman" w:eastAsia="Times New Roman" w:hAnsi="Times New Roman" w:cs="Times New Roman"/>
+          <w:kern w:val="0"/>
+          <w:sz w:val="24"/>
+          <w:szCs w:val="24"/>
+          <w14:ligatures w14:val="none"/>
+        </w:rPr>
+      </w:pPr>
+      <w:r>
+        <w:pict w14:anchorId="7DD80F32">
+          <v:rect id="_x0000_i1025" style="width:0;height:1.5pt" o:hralign="center" o:hrstd="t" o:hr="t" fillcolor="#a0a0a0" stroked="f"/>
+        </w:pict>
+      </w:r>
+    </w:p>
+    <w:p>
+      <w:pPr>
+        <w:pStyle w:val="ListParagraph"/>
+        <w:numPr>
+          <w:ilvl w:val="0"/>
+          <w:numId w:val="32"/>
+        </w:numPr>
+        <w:spacing w:before="100" w:beforeAutospacing="1" w:after="100" w:afterAutospacing="1" w:line="240" w:lineRule="auto"/>
+        <w:outlineLvl w:val="1"/>
+        <w:rPr>
+          <w:rFonts w:ascii="Times New Roman" w:eastAsia="Times New Roman" w:hAnsi="Times New Roman" w:cs="Times New Roman"/>
+          <w:b/>
+          <w:bCs/>
+          <w:kern w:val="0"/>
+          <w:sz w:val="36"/>
+          <w:szCs w:val="36"/>
+          <w14:ligatures w14:val="none"/>
+        </w:rPr>
+      </w:pPr>
+      <w:r>
+        <w:rPr>
+          <w:rFonts w:ascii="Times New Roman" w:eastAsia="Times New Roman" w:hAnsi="Times New Roman" w:cs="Times New Roman"/>
+          <w:b/>
+          <w:bCs/>
+          <w:kern w:val="0"/>
+          <w:sz w:val="36"/>
+          <w:szCs w:val="36"/>
+          <w14:ligatures w14:val="none"/>
+        </w:rPr>
+        <w:t>2. Chọn từ chuyên khoa</w:t>
+      </w:r>
+    </w:p>
+    <w:p>
+      <w:pPr>
+        <w:pStyle w:val="ListParagraph"/>
+        <w:numPr>
+          <w:ilvl w:val="0"/>
+          <w:numId w:val="32"/>
+        </w:numPr>
+        <w:tabs>
+          <w:tab w:val="left" w:pos="916"/>
+          <w:tab w:val="left" w:pos="1832"/>
+          <w:tab w:val="left" w:pos="2748"/>
+          <w:tab w:val="left" w:pos="3664"/>
+          <w:tab w:val="left" w:pos="4580"/>
+          <w:tab w:val="left" w:pos="5496"/>
+          <w:tab w:val="left" w:pos="6412"/>
+          <w:tab w:val="left" w:pos="7328"/>
+          <w:tab w:val="left" w:pos="8244"/>
+          <w:tab w:val="left" w:pos="9160"/>
+          <w:tab w:val="left" w:pos="10076"/>
+          <w:tab w:val="left" w:pos="10992"/>
+          <w:tab w:val="left" w:pos="11908"/>
+          <w:tab w:val="left" w:pos="12824"/>
+          <w:tab w:val="left" w:pos="13740"/>
+          <w:tab w:val="left" w:pos="14656"/>
+        </w:tabs>
+        <w:spacing w:before="0" w:after="0" w:line="240" w:lineRule="auto"/>
+        <w:rPr>
+          <w:rFonts w:ascii="Courier New" w:eastAsia="Times New Roman" w:hAnsi="Courier New" w:cs="Courier New"/>
+          <w:kern w:val="0"/>
+          <w:sz w:val="20"/>
+          <w:szCs w:val="20"/>
+          <w14:ligatures w14:val="none"/>
+        </w:rPr>
+      </w:pPr>
+      <w:r>
+        <w:rPr>
+          <w:rFonts w:ascii="Courier New" w:eastAsia="Times New Roman" w:hAnsi="Courier New" w:cs="Courier New"/>
+          <w:kern w:val="0"/>
+          <w:sz w:val="20"/>
+          <w:szCs w:val="20"/>
+          <w14:ligatures w14:val="none"/>
+        </w:rPr>
+        <w:t>expertiseId có</w:t>
+      </w:r>
+      <w:r>
+        <w:rPr>
+          <w:rFonts w:ascii="Courier New" w:eastAsia="Times New Roman" w:hAnsi="Courier New" w:cs="Courier New"/>
+          <w:kern w:val="0"/>
+          <w:sz w:val="20"/>
+          <w:szCs w:val="20"/>
+          <w14:ligatures w14:val="none"/>
+        </w:rPr>
+        <w:br/>
+      </w:r>
+      <w:r>
+        <w:rPr>
+          <w:rFonts w:ascii="Courier New" w:eastAsia="Times New Roman" w:hAnsi="Courier New" w:cs="Courier New"/>
+          <w:kern w:val="0"/>
+          <w:sz w:val="20"/>
+          <w:szCs w:val="20"/>
+          <w14:ligatures w14:val="none"/>
+        </w:rPr>
+        <w:br/>
+        <w:t>→ lock expertise</w:t>
+      </w:r>
+      <w:r>
+        <w:rPr>
+          <w:rFonts w:ascii="Courier New" w:eastAsia="Times New Roman" w:hAnsi="Courier New" w:cs="Courier New"/>
+          <w:kern w:val="0"/>
+          <w:sz w:val="20"/>
+          <w:szCs w:val="20"/>
+          <w14:ligatures w14:val="none"/>
+        </w:rPr>
+        <w:br/>
+        <w:t>→ doctor selectable</w:t>
+      </w:r>
+      <w:r>
+        <w:rPr>
+          <w:rFonts w:ascii="Courier New" w:eastAsia="Times New Roman" w:hAnsi="Courier New" w:cs="Courier New"/>
+          <w:kern w:val="0"/>
+          <w:sz w:val="20"/>
+          <w:szCs w:val="20"/>
+          <w14:ligatures w14:val="none"/>
+        </w:rPr>
+        <w:br/>
+        <w:t>→ service optional</w:t>
+      </w:r>
+    </w:p>
+    <w:p>
+      <w:pPr>
+        <w:pStyle w:val="ListParagraph"/>
+        <w:numPr>
+          <w:ilvl w:val="0"/>
+          <w:numId w:val="32"/>
+        </w:numPr>
+        <w:spacing w:before="0" w:after="0" w:line="240" w:lineRule="auto"/>
+        <w:rPr>
+          <w:rFonts w:ascii="Times New Roman" w:eastAsia="Times New Roman" w:hAnsi="Times New Roman" w:cs="Times New Roman"/>
+          <w:kern w:val="0"/>
+          <w:sz w:val="24"/>
+          <w:szCs w:val="24"/>
+          <w14:ligatures w14:val="none"/>
+        </w:rPr>
+      </w:pPr>
+      <w:r>
+        <w:pict w14:anchorId="64CBDE1C">
+          <v:rect id="_x0000_i1026" style="width:0;height:1.5pt" o:hralign="center" o:hrstd="t" o:hr="t" fillcolor="#a0a0a0" stroked="f"/>
+        </w:pict>
+      </w:r>
+    </w:p>
+    <w:p>
+      <w:pPr>
+        <w:pStyle w:val="ListParagraph"/>
+        <w:numPr>
+          <w:ilvl w:val="0"/>
+          <w:numId w:val="32"/>
+        </w:numPr>
+        <w:spacing w:before="100" w:beforeAutospacing="1" w:after="100" w:afterAutospacing="1" w:line="240" w:lineRule="auto"/>
+        <w:outlineLvl w:val="1"/>
+        <w:rPr>
+          <w:rFonts w:ascii="Times New Roman" w:eastAsia="Times New Roman" w:hAnsi="Times New Roman" w:cs="Times New Roman"/>
+          <w:b/>
+          <w:bCs/>
+          <w:kern w:val="0"/>
+          <w:sz w:val="36"/>
+          <w:szCs w:val="36"/>
+          <w14:ligatures w14:val="none"/>
+        </w:rPr>
+      </w:pPr>
+      <w:r>
+        <w:rPr>
+          <w:rFonts w:ascii="Times New Roman" w:eastAsia="Times New Roman" w:hAnsi="Times New Roman" w:cs="Times New Roman"/>
+          <w:b/>
+          <w:bCs/>
+          <w:kern w:val="0"/>
+          <w:sz w:val="36"/>
+          <w:szCs w:val="36"/>
+          <w14:ligatures w14:val="none"/>
+        </w:rPr>
+        <w:t>3. Chọn từ dịch vụ</w:t>
+      </w:r>
+    </w:p>
+    <w:p>
+      <w:pPr>
+        <w:pStyle w:val="ListParagraph"/>
+        <w:numPr>
+          <w:ilvl w:val="0"/>
+          <w:numId w:val="32"/>
+        </w:numPr>
+        <w:tabs>
+          <w:tab w:val="left" w:pos="916"/>
+          <w:tab w:val="left" w:pos="1832"/>
+          <w:tab w:val="left" w:pos="2748"/>
+          <w:tab w:val="left" w:pos="3664"/>
+          <w:tab w:val="left" w:pos="4580"/>
+          <w:tab w:val="left" w:pos="5496"/>
+          <w:tab w:val="left" w:pos="6412"/>
+          <w:tab w:val="left" w:pos="7328"/>
+          <w:tab w:val="left" w:pos="8244"/>
+          <w:tab w:val="left" w:pos="9160"/>
+          <w:tab w:val="left" w:pos="10076"/>
+          <w:tab w:val="left" w:pos="10992"/>
+          <w:tab w:val="left" w:pos="11908"/>
+          <w:tab w:val="left" w:pos="12824"/>
+          <w:tab w:val="left" w:pos="13740"/>
+          <w:tab w:val="left" w:pos="14656"/>
+        </w:tabs>
+        <w:spacing w:before="0" w:after="0" w:line="240" w:lineRule="auto"/>
+        <w:rPr>
+          <w:rFonts w:ascii="Courier New" w:eastAsia="Times New Roman" w:hAnsi="Courier New" w:cs="Courier New"/>
+          <w:kern w:val="0"/>
+          <w:sz w:val="20"/>
+          <w:szCs w:val="20"/>
+          <w14:ligatures w14:val="none"/>
+        </w:rPr>
+      </w:pPr>
+      <w:r>
+        <w:rPr>
+          <w:rFonts w:ascii="Courier New" w:eastAsia="Times New Roman" w:hAnsi="Courier New" w:cs="Courier New"/>
+          <w:kern w:val="0"/>
+          <w:sz w:val="20"/>
+          <w:szCs w:val="20"/>
+          <w14:ligatures w14:val="none"/>
+        </w:rPr>
+        <w:t>serviceId có</w:t>
+      </w:r>
+      <w:r>
+        <w:rPr>
+          <w:rFonts w:ascii="Courier New" w:eastAsia="Times New Roman" w:hAnsi="Courier New" w:cs="Courier New"/>
+          <w:kern w:val="0"/>
+          <w:sz w:val="20"/>
+          <w:szCs w:val="20"/>
+          <w14:ligatures w14:val="none"/>
+        </w:rPr>
+        <w:br/>
+      </w:r>
+      <w:r>
+        <w:rPr>
+          <w:rFonts w:ascii="Courier New" w:eastAsia="Times New Roman" w:hAnsi="Courier New" w:cs="Courier New"/>
+          <w:kern w:val="0"/>
+          <w:sz w:val="20"/>
+          <w:szCs w:val="20"/>
+          <w14:ligatures w14:val="none"/>
+        </w:rPr>
+        <w:br/>
+        <w:t>→ lock service</w:t>
+      </w:r>
+      <w:r>
+        <w:rPr>
+          <w:rFonts w:ascii="Courier New" w:eastAsia="Times New Roman" w:hAnsi="Courier New" w:cs="Courier New"/>
+          <w:kern w:val="0"/>
+          <w:sz w:val="20"/>
+          <w:szCs w:val="20"/>
+          <w14:ligatures w14:val="none"/>
+        </w:rPr>
+        <w:br/>
+        <w:t>→ doctor optional</w:t>
+      </w:r>
+      <w:r>
+        <w:rPr>
+          <w:rFonts w:ascii="Courier New" w:eastAsia="Times New Roman" w:hAnsi="Courier New" w:cs="Courier New"/>
+          <w:kern w:val="0"/>
+          <w:sz w:val="20"/>
+          <w:szCs w:val="20"/>
+          <w14:ligatures w14:val="none"/>
+        </w:rPr>
+        <w:br/>
+        <w:t>→ expertise optional</w:t>
+      </w:r>
+    </w:p>
+    <w:p>
+      <w:pPr>
+        <w:pStyle w:val="ListParagraph"/>
+        <w:numPr>
+          <w:ilvl w:val="0"/>
+          <w:numId w:val="32"/>
+        </w:numPr>
+        <w:spacing w:before="100" w:beforeAutospacing="1" w:after="100" w:afterAutospacing="1" w:line="240" w:lineRule="auto"/>
+        <w:rPr>
+          <w:rFonts w:ascii="Times New Roman" w:eastAsia="Times New Roman" w:hAnsi="Times New Roman" w:cs="Times New Roman"/>
+          <w:kern w:val="0"/>
+          <w:sz w:val="24"/>
+          <w:szCs w:val="24"/>
+          <w14:ligatures w14:val="none"/>
+        </w:rPr>
+      </w:pPr>
+      <w:r>
+        <w:rPr>
+          <w:rFonts w:ascii="Segoe UI Emoji" w:eastAsia="Times New Roman" w:hAnsi="Segoe UI Emoji" w:cs="Segoe UI Emoji"/>
+          <w:kern w:val="0"/>
+          <w:sz w:val="24"/>
+          <w:szCs w:val="24"/>
+          <w14:ligatures w14:val="none"/>
+        </w:rPr>
+        <w:t>🔥</w:t>
+      </w:r>
+      <w:r>
+        <w:rPr>
+          <w:rFonts w:ascii="Times New Roman" w:eastAsia="Times New Roman" w:hAnsi="Times New Roman" w:cs="Times New Roman"/>
+          <w:kern w:val="0"/>
+          <w:sz w:val="24"/>
+          <w:szCs w:val="24"/>
+          <w14:ligatures w14:val="none"/>
+        </w:rPr>
+        <w:t xml:space="preserve"> cái này hợp lý cực.</w:t>
+      </w:r>
+    </w:p>
+    <w:p>
+      <w:pPr>
+        <w:pStyle w:val="ListParagraph"/>
+        <w:numPr>
+          <w:ilvl w:val="0"/>
+          <w:numId w:val="32"/>
+        </w:numPr>
+        <w:spacing w:before="100" w:beforeAutospacing="1" w:after="100" w:afterAutospacing="1" w:line="240" w:lineRule="auto"/>
+        <w:rPr>
+          <w:rFonts w:ascii="Times New Roman" w:eastAsia="Times New Roman" w:hAnsi="Times New Roman" w:cs="Times New Roman"/>
+          <w:kern w:val="0"/>
+          <w:sz w:val="24"/>
+          <w:szCs w:val="24"/>
+          <w14:ligatures w14:val="none"/>
+        </w:rPr>
+      </w:pPr>
+      <w:r>
+        <w:rPr>
+          <w:rFonts w:ascii="Times New Roman" w:eastAsia="Times New Roman" w:hAnsi="Times New Roman" w:cs="Times New Roman"/>
+          <w:kern w:val="0"/>
+          <w:sz w:val="24"/>
+          <w:szCs w:val="24"/>
+          <w14:ligatures w14:val="none"/>
+        </w:rPr>
+        <w:t>Ví dụ:</w:t>
+      </w:r>
+    </w:p>
+    <w:p>
+      <w:pPr>
+        <w:pStyle w:val="ListParagraph"/>
+        <w:numPr>
+          <w:ilvl w:val="0"/>
+          <w:numId w:val="32"/>
+        </w:numPr>
+        <w:tabs>
+          <w:tab w:val="left" w:pos="916"/>
+          <w:tab w:val="left" w:pos="1832"/>
+          <w:tab w:val="left" w:pos="2748"/>
+          <w:tab w:val="left" w:pos="3664"/>
+          <w:tab w:val="left" w:pos="4580"/>
+          <w:tab w:val="left" w:pos="5496"/>
+          <w:tab w:val="left" w:pos="6412"/>
+          <w:tab w:val="left" w:pos="7328"/>
+          <w:tab w:val="left" w:pos="8244"/>
+          <w:tab w:val="left" w:pos="9160"/>
+          <w:tab w:val="left" w:pos="10076"/>
+          <w:tab w:val="left" w:pos="10992"/>
+          <w:tab w:val="left" w:pos="11908"/>
+          <w:tab w:val="left" w:pos="12824"/>
+          <w:tab w:val="left" w:pos="13740"/>
+          <w:tab w:val="left" w:pos="14656"/>
+        </w:tabs>
+        <w:spacing w:before="0" w:after="0" w:line="240" w:lineRule="auto"/>
+        <w:rPr>
+          <w:rFonts w:ascii="Courier New" w:eastAsia="Times New Roman" w:hAnsi="Courier New" w:cs="Courier New"/>
+          <w:kern w:val="0"/>
+          <w:sz w:val="20"/>
+          <w:szCs w:val="20"/>
+          <w14:ligatures w14:val="none"/>
+        </w:rPr>
+      </w:pPr>
+      <w:r>
+        <w:rPr>
+          <w:rFonts w:ascii="Courier New" w:eastAsia="Times New Roman" w:hAnsi="Courier New" w:cs="Courier New"/>
+          <w:kern w:val="0"/>
+          <w:sz w:val="20"/>
+          <w:szCs w:val="20"/>
+          <w14:ligatures w14:val="none"/>
+        </w:rPr>
+        <w:t>Xét nghiệm máu</w:t>
+      </w:r>
+      <w:r>
+        <w:rPr>
+          <w:rFonts w:ascii="Courier New" w:eastAsia="Times New Roman" w:hAnsi="Courier New" w:cs="Courier New"/>
+          <w:kern w:val="0"/>
+          <w:sz w:val="20"/>
+          <w:szCs w:val="20"/>
+          <w14:ligatures w14:val="none"/>
+        </w:rPr>
+        <w:br/>
+        <w:t>MRI</w:t>
+      </w:r>
+      <w:r>
+        <w:rPr>
+          <w:rFonts w:ascii="Courier New" w:eastAsia="Times New Roman" w:hAnsi="Courier New" w:cs="Courier New"/>
+          <w:kern w:val="0"/>
+          <w:sz w:val="20"/>
+          <w:szCs w:val="20"/>
+          <w14:ligatures w14:val="none"/>
+        </w:rPr>
+        <w:br/>
+        <w:t>CT Scan</w:t>
+      </w:r>
+    </w:p>
+    <w:p>
+      <w:pPr>
+        <w:pStyle w:val="ListParagraph"/>
+        <w:numPr>
+          <w:ilvl w:val="0"/>
+          <w:numId w:val="32"/>
+        </w:numPr>
+        <w:spacing w:before="100" w:beforeAutospacing="1" w:after="100" w:afterAutospacing="1" w:line="240" w:lineRule="auto"/>
+        <w:rPr>
+          <w:rFonts w:ascii="Times New Roman" w:eastAsia="Times New Roman" w:hAnsi="Times New Roman" w:cs="Times New Roman"/>
+          <w:kern w:val="0"/>
+          <w:sz w:val="24"/>
+          <w:szCs w:val="24"/>
+          <w14:ligatures w14:val="none"/>
+        </w:rPr>
+      </w:pPr>
+      <w:r>
+        <w:rPr>
+          <w:rFonts w:ascii="Times New Roman" w:eastAsia="Times New Roman" w:hAnsi="Times New Roman" w:cs="Times New Roman"/>
+          <w:kern w:val="0"/>
+          <w:sz w:val="24"/>
+          <w:szCs w:val="24"/>
+          <w14:ligatures w14:val="none"/>
+        </w:rPr>
+        <w:t>không cần chuyên khoa trước.</w:t>
+      </w:r>
+    </w:p>
+    <w:p>
+      <w:pPr>
+        <w:pStyle w:val="ListParagraph"/>
+        <w:numPr>
+          <w:ilvl w:val="0"/>
+          <w:numId w:val="32"/>
+        </w:numPr>
+        <w:spacing w:before="0" w:after="0" w:line="240" w:lineRule="auto"/>
+        <w:rPr>
+          <w:rFonts w:ascii="Times New Roman" w:eastAsia="Times New Roman" w:hAnsi="Times New Roman" w:cs="Times New Roman"/>
+          <w:kern w:val="0"/>
+          <w:sz w:val="24"/>
+          <w:szCs w:val="24"/>
+          <w14:ligatures w14:val="none"/>
+        </w:rPr>
+      </w:pPr>
+      <w:r>
+        <w:pict w14:anchorId="7C14B634">
+          <v:rect id="_x0000_i1027" style="width:0;height:1.5pt" o:hralign="center" o:hrstd="t" o:hr="t" fillcolor="#a0a0a0" stroked="f"/>
+        </w:pict>
+      </w:r>
+    </w:p>
+    <w:p>
+      <w:pPr>
+        <w:pStyle w:val="ListParagraph"/>
+        <w:numPr>
+          <w:ilvl w:val="0"/>
+          <w:numId w:val="32"/>
+        </w:numPr>
+        <w:spacing w:before="100" w:beforeAutospacing="1" w:after="100" w:afterAutospacing="1" w:line="240" w:lineRule="auto"/>
+        <w:outlineLvl w:val="1"/>
+        <w:rPr>
+          <w:rFonts w:ascii="Times New Roman" w:eastAsia="Times New Roman" w:hAnsi="Times New Roman" w:cs="Times New Roman"/>
+          <w:b/>
+          <w:bCs/>
+          <w:kern w:val="0"/>
+          <w:sz w:val="36"/>
+          <w:szCs w:val="36"/>
+          <w14:ligatures w14:val="none"/>
+        </w:rPr>
+      </w:pPr>
+      <w:r>
+        <w:rPr>
+          <w:rFonts w:ascii="Times New Roman" w:eastAsia="Times New Roman" w:hAnsi="Times New Roman" w:cs="Times New Roman"/>
+          <w:b/>
+          <w:bCs/>
+          <w:kern w:val="0"/>
+          <w:sz w:val="36"/>
+          <w:szCs w:val="36"/>
+          <w14:ligatures w14:val="none"/>
+        </w:rPr>
+        <w:t>4. Direct booking</w:t>
+      </w:r>
+    </w:p>
+    <w:p>
+      <w:pPr>
+        <w:pStyle w:val="ListParagraph"/>
+        <w:numPr>
+          <w:ilvl w:val="0"/>
+          <w:numId w:val="32"/>
+        </w:numPr>
+        <w:tabs>
+          <w:tab w:val="left" w:pos="916"/>
+          <w:tab w:val="left" w:pos="1832"/>
+          <w:tab w:val="left" w:pos="2748"/>
+          <w:tab w:val="left" w:pos="3664"/>
+          <w:tab w:val="left" w:pos="4580"/>
+          <w:tab w:val="left" w:pos="5496"/>
+          <w:tab w:val="left" w:pos="6412"/>
+          <w:tab w:val="left" w:pos="7328"/>
+          <w:tab w:val="left" w:pos="8244"/>
+          <w:tab w:val="left" w:pos="9160"/>
+          <w:tab w:val="left" w:pos="10076"/>
+          <w:tab w:val="left" w:pos="10992"/>
+          <w:tab w:val="left" w:pos="11908"/>
+          <w:tab w:val="left" w:pos="12824"/>
+          <w:tab w:val="left" w:pos="13740"/>
+          <w:tab w:val="left" w:pos="14656"/>
+        </w:tabs>
+        <w:spacing w:before="0" w:after="0" w:line="240" w:lineRule="auto"/>
+        <w:rPr>
+          <w:rFonts w:ascii="Courier New" w:eastAsia="Times New Roman" w:hAnsi="Courier New" w:cs="Courier New"/>
+          <w:kern w:val="0"/>
+          <w:sz w:val="20"/>
+          <w:szCs w:val="20"/>
+          <w14:ligatures w14:val="none"/>
+        </w:rPr>
+      </w:pPr>
+      <w:r>
+        <w:rPr>
+          <w:rFonts w:ascii="Courier New" w:eastAsia="Times New Roman" w:hAnsi="Courier New" w:cs="Courier New"/>
+          <w:kern w:val="0"/>
+          <w:sz w:val="20"/>
+          <w:szCs w:val="20"/>
+          <w14:ligatures w14:val="none"/>
+        </w:rPr>
+        <w:t>không doctor</w:t>
+      </w:r>
+      <w:r>
+        <w:rPr>
+          <w:rFonts w:ascii="Courier New" w:eastAsia="Times New Roman" w:hAnsi="Courier New" w:cs="Courier New"/>
+          <w:kern w:val="0"/>
+          <w:sz w:val="20"/>
+          <w:szCs w:val="20"/>
+          <w14:ligatures w14:val="none"/>
+        </w:rPr>
+        <w:br/>
+        <w:t>không expertise</w:t>
+      </w:r>
+      <w:r>
+        <w:rPr>
+          <w:rFonts w:ascii="Courier New" w:eastAsia="Times New Roman" w:hAnsi="Courier New" w:cs="Courier New"/>
+          <w:kern w:val="0"/>
+          <w:sz w:val="20"/>
+          <w:szCs w:val="20"/>
+          <w14:ligatures w14:val="none"/>
+        </w:rPr>
+        <w:br/>
+        <w:t>không service</w:t>
+      </w:r>
+      <w:r>
+        <w:rPr>
+          <w:rFonts w:ascii="Courier New" w:eastAsia="Times New Roman" w:hAnsi="Courier New" w:cs="Courier New"/>
+          <w:kern w:val="0"/>
+          <w:sz w:val="20"/>
+          <w:szCs w:val="20"/>
+          <w14:ligatures w14:val="none"/>
+        </w:rPr>
+        <w:br/>
+      </w:r>
+      <w:r>
+        <w:rPr>
+          <w:rFonts w:ascii="Courier New" w:eastAsia="Times New Roman" w:hAnsi="Courier New" w:cs="Courier New"/>
+          <w:kern w:val="0"/>
+          <w:sz w:val="20"/>
+          <w:szCs w:val="20"/>
+          <w14:ligatures w14:val="none"/>
+        </w:rPr>
+        <w:br/>
+        <w:t>→ chỉ:</w:t>
+      </w:r>
+      <w:r>
+        <w:rPr>
+          <w:rFonts w:ascii="Courier New" w:eastAsia="Times New Roman" w:hAnsi="Courier New" w:cs="Courier New"/>
+          <w:kern w:val="0"/>
+          <w:sz w:val="20"/>
+          <w:szCs w:val="20"/>
+          <w14:ligatures w14:val="none"/>
+        </w:rPr>
+        <w:br/>
+        <w:t xml:space="preserve">   - date</w:t>
+      </w:r>
+      <w:r>
+        <w:rPr>
+          <w:rFonts w:ascii="Courier New" w:eastAsia="Times New Roman" w:hAnsi="Courier New" w:cs="Courier New"/>
+          <w:kern w:val="0"/>
+          <w:sz w:val="20"/>
+          <w:szCs w:val="20"/>
+          <w14:ligatures w14:val="none"/>
+        </w:rPr>
+        <w:br/>
+        <w:t xml:space="preserve">   - time</w:t>
+      </w:r>
+      <w:r>
+        <w:rPr>
+          <w:rFonts w:ascii="Courier New" w:eastAsia="Times New Roman" w:hAnsi="Courier New" w:cs="Courier New"/>
+          <w:kern w:val="0"/>
+          <w:sz w:val="20"/>
+          <w:szCs w:val="20"/>
+          <w14:ligatures w14:val="none"/>
+        </w:rPr>
+        <w:br/>
+        <w:t xml:space="preserve">   - description</w:t>
+      </w:r>
+    </w:p>
+    <w:p>
+      <w:pPr>
+        <w:ind w:left="680" w:firstLine="720"/>
+        <w:jc w:val="both"/>
+      </w:pPr>
+      <w:r>
+        <w:br w:type="page"/>
+      </w:r>
+    </w:p>
+    <w:p>
+      <w:pPr>
+        <w:numPr>
+          <w:ilvl w:val="1"/>
+          <w:numId w:val="32"/>
+        </w:numPr>
+      </w:pPr>
     </w:p>
     <w:sectPr>
       <w:pgSz w:w="12240" w:h="15840"/>
@@ -3515,6 +4314,7 @@
   <w:style w:type="character" w:default="1" w:styleId="DefaultParagraphFont">
     <w:name w:val="Default Paragraph Font"/>
     <w:uiPriority w:val="1"/>
+    <w:semiHidden/>
     <w:unhideWhenUsed/>
   </w:style>
   <w:style w:type="table" w:default="1" w:styleId="TableNormal">
@@ -4371,6 +5171,89 @@
     </w:pPr>
     <w:rPr>
       <w:rFonts w:eastAsiaTheme="minorEastAsia"/>
+    </w:rPr>
+  </w:style>
+  <w:style w:type="paragraph" w:styleId="HTMLPreformatted">
+    <w:name w:val="HTML Preformatted"/>
+    <w:basedOn w:val="Normal"/>
+    <w:link w:val="HTMLPreformattedChar"/>
+    <w:uiPriority w:val="99"/>
+    <w:semiHidden/>
+    <w:unhideWhenUsed/>
+    <w:rsid w:val="00742CE6"/>
+    <w:pPr>
+      <w:tabs>
+        <w:tab w:val="left" w:pos="916"/>
+        <w:tab w:val="left" w:pos="1832"/>
+        <w:tab w:val="left" w:pos="2748"/>
+        <w:tab w:val="left" w:pos="3664"/>
+        <w:tab w:val="left" w:pos="4580"/>
+        <w:tab w:val="left" w:pos="5496"/>
+        <w:tab w:val="left" w:pos="6412"/>
+        <w:tab w:val="left" w:pos="7328"/>
+        <w:tab w:val="left" w:pos="8244"/>
+        <w:tab w:val="left" w:pos="9160"/>
+        <w:tab w:val="left" w:pos="10076"/>
+        <w:tab w:val="left" w:pos="10992"/>
+        <w:tab w:val="left" w:pos="11908"/>
+        <w:tab w:val="left" w:pos="12824"/>
+        <w:tab w:val="left" w:pos="13740"/>
+        <w:tab w:val="left" w:pos="14656"/>
+      </w:tabs>
+      <w:spacing w:before="0" w:after="0" w:line="240" w:lineRule="auto"/>
+    </w:pPr>
+    <w:rPr>
+      <w:rFonts w:ascii="Courier New" w:eastAsia="Times New Roman" w:hAnsi="Courier New" w:cs="Courier New"/>
+      <w:kern w:val="0"/>
+      <w:sz w:val="20"/>
+      <w:szCs w:val="20"/>
+      <w14:ligatures w14:val="none"/>
+    </w:rPr>
+  </w:style>
+  <w:style w:type="character" w:customStyle="1" w:styleId="HTMLPreformattedChar">
+    <w:name w:val="HTML Preformatted Char"/>
+    <w:basedOn w:val="DefaultParagraphFont"/>
+    <w:link w:val="HTMLPreformatted"/>
+    <w:uiPriority w:val="99"/>
+    <w:semiHidden/>
+    <w:rsid w:val="00742CE6"/>
+    <w:rPr>
+      <w:rFonts w:ascii="Courier New" w:eastAsia="Times New Roman" w:hAnsi="Courier New" w:cs="Courier New"/>
+      <w:kern w:val="0"/>
+      <w:sz w:val="20"/>
+      <w:szCs w:val="20"/>
+      <w14:ligatures w14:val="none"/>
+    </w:rPr>
+  </w:style>
+  <w:style w:type="character" w:styleId="HTMLCode">
+    <w:name w:val="HTML Code"/>
+    <w:basedOn w:val="DefaultParagraphFont"/>
+    <w:uiPriority w:val="99"/>
+    <w:semiHidden/>
+    <w:unhideWhenUsed/>
+    <w:rsid w:val="00742CE6"/>
+    <w:rPr>
+      <w:rFonts w:ascii="Courier New" w:eastAsia="Times New Roman" w:hAnsi="Courier New" w:cs="Courier New"/>
+      <w:sz w:val="20"/>
+      <w:szCs w:val="20"/>
+    </w:rPr>
+  </w:style>
+  <w:style w:type="paragraph" w:styleId="NormalWeb">
+    <w:name w:val="Normal (Web)"/>
+    <w:basedOn w:val="Normal"/>
+    <w:uiPriority w:val="99"/>
+    <w:semiHidden/>
+    <w:unhideWhenUsed/>
+    <w:rsid w:val="00742CE6"/>
+    <w:pPr>
+      <w:spacing w:before="100" w:beforeAutospacing="1" w:after="100" w:afterAutospacing="1" w:line="240" w:lineRule="auto"/>
+    </w:pPr>
+    <w:rPr>
+      <w:rFonts w:ascii="Times New Roman" w:eastAsia="Times New Roman" w:hAnsi="Times New Roman" w:cs="Times New Roman"/>
+      <w:kern w:val="0"/>
+      <w:sz w:val="24"/>
+      <w:szCs w:val="24"/>
+      <w14:ligatures w14:val="none"/>
     </w:rPr>
   </w:style>
 </w:styles>

</xml_diff>